<commit_message>
AED invoices now convert: a currency fixed against the dollar is derived from the ECB's USD rate; and the invoice review accepts a typed rate to INR for any currency the ECB does not publish (frozen like an ECB rate, noted on the invoice's timeline)
</commit_message>
<xml_diff>
--- a/backend/tests/api_suites/fixtures/e2e_docs/c06_usd.docx
+++ b/backend/tests/api_suites/fixtures/e2e_docs/c06_usd.docx
@@ -83,7 +83,7 @@
           </w:tcPr>
           <w:p>
             <w:r>
-              <w:t>Amount (AED)</w:t>
+              <w:t>Amount (QAR)</w:t>
             </w:r>
           </w:p>
         </w:tc>
@@ -123,7 +123,7 @@
     </w:tbl>
     <w:p>
       <w:r>
-        <w:t>Total AED 1000.00</w:t>
+        <w:t>Total QAR 1000.00</w:t>
       </w:r>
     </w:p>
     <w:sectPr>

</xml_diff>